<commit_message>
Refuse unsupported actions before routing; use gemini-3.5-flash-lite
Live test showed the root routed 'send a rescue boat and reserve a shelter'
into the pipeline instead of refusing, so refusals are now checked first.
gemini-2.5 models return 404 for new API keys.

Co-Authored-By: Claude Opus 5.5 <noreply@anthropic.com>
Claude-Session: https://claude.ai/code/session_016Wngwe9rSdPNsSJxQY4QgR
</commit_message>
<xml_diff>
--- a/docs/Assignment_2_Completed.docx
+++ b/docs/Assignment_2_Completed.docx
@@ -3720,7 +3720,7 @@
           <w:sz w:val="21"/>
           <w:szCs w:val="21"/>
         </w:rPr>
-        <w:t xml:space="preserve">All LLM agents use gemini-2.5-flash. Specialist agents inside workflows have disallow_transfer_to_parent and disallow_transfer_to_peers set, so they cannot hand the conversation away. Stages after intake use the before-agent callback flood_disaster_assistant.callbacks.workflow_gate. It skips the stage without calling the model when intake is not COMPLETE, or when a parallel branch was not requested, and it writes "SKIPPED: &lt;reason&gt;" to that branch's output key.</w:t>
+        <w:t xml:space="preserve">All LLM agents use gemini-3.5-flash-lite (available on the Gemini API free tier, 15 requests per minute). Specialist agents inside workflows have disallow_transfer_to_parent and disallow_transfer_to_peers set, so they cannot hand the conversation away. Stages after intake use the before-agent callback flood_disaster_assistant.callbacks.workflow_gate. It skips the stage without calling the model when intake is not COMPLETE, or when a parallel branch was not requested, and it writes "SKIPPED: &lt;reason&gt;" to that branch's output key.</w:t>
       </w:r>
     </w:p>
     <w:p>
@@ -3957,7 +3957,7 @@
                 <w:sz w:val="19"/>
                 <w:szCs w:val="19"/>
               </w:rPr>
-              <w:t xml:space="preserve">Greets the user and routes each message. Immediate-danger descriptions and every supported request (incident status, classification, safety guidance, relief point, incident + relief together, or a reply to an earlier question) are transferred to assistance_pipeline.</w:t>
+              <w:t xml:space="preserve">Greets the user and routes each message. It first checks for unsupported or unsafe actions and refuses them without transferring, even when the message mentions a flood or shelter. Immediate-danger descriptions and every supported request (incident status, classification, safety guidance, relief point, incident + relief together, or a reply to an earlier question) are transferred to assistance_pipeline.</w:t>
             </w:r>
           </w:p>
           <w:p>
@@ -8011,7 +8011,7 @@
           <w:sz w:val="21"/>
           <w:szCs w:val="21"/>
         </w:rPr>
-        <w:t xml:space="preserve">Run with: adk web (from the project folder), select flood_disaster_assistant. Use a new session for each test. The expected results below are the values in the supplied records. After running each test, paste the observed result and screenshot into the red placeholders.</w:t>
+        <w:t xml:space="preserve">Run with: adk web (from the project folder), select flood_disaster_assistant. Use a new session for each test and wait about one minute between tests: a full request uses about 11 model calls and the free tier allows 15 per minute. The expected results below are the values in the supplied records. After running each test, paste the observed result and screenshot into the red placeholders.</w:t>
       </w:r>
     </w:p>
     <w:p>

</xml_diff>

<commit_message>
Fill Section F with observed ADK Web results and screenshots
Co-Authored-By: Claude Opus 5.5 <noreply@anthropic.com>
Claude-Session: https://claude.ai/code/session_016Wngwe9rSdPNsSJxQY4QgR
</commit_message>
<xml_diff>
--- a/docs/Assignment_2_Completed.docx
+++ b/docs/Assignment_2_Completed.docx
@@ -8011,7 +8011,7 @@
           <w:sz w:val="21"/>
           <w:szCs w:val="21"/>
         </w:rPr>
-        <w:t xml:space="preserve">Run with: adk web (from the project folder), select flood_disaster_assistant. Use a new session for each test and wait about one minute between tests: a full request uses about 11 model calls and the free tier allows 15 per minute. The expected results below are the values in the supplied records. After running each test, paste the observed result and screenshot into the red placeholders.</w:t>
+        <w:t xml:space="preserve">Run with: adk web (from the project folder), select flood_disaster_assistant. Use a new session for each test and wait about one minute between tests: a full request uses about 11 model calls and the free tier allows 15 per minute. The expected results below are the values in the supplied records. The actual results below were observed in ADK Web 2.9.2 with model gemini-3.5-flash-lite.</w:t>
       </w:r>
     </w:p>
     <w:p>
@@ -8385,13 +8385,105 @@
             <w:r>
               <w:rPr>
                 <w:rFonts w:ascii="Arial" w:cs="Arial" w:eastAsia="Arial" w:hAnsi="Arial"/>
-                <w:i/>
-                <w:iCs/>
-                <w:color w:val="B91C1C"/>
-                <w:sz w:val="19"/>
-                <w:szCs w:val="19"/>
-              </w:rPr>
-              <w:t xml:space="preserve">[To complete: paste the value observed in ADK Web]</w:t>
+                <w:sz w:val="19"/>
+                <w:szCs w:val="19"/>
+              </w:rPr>
+              <w:t xml:space="preserve">Matches the expected result. The ADK Web Agent Structure view of flood_disaster_assistant shows:</w:t>
+            </w:r>
+          </w:p>
+          <w:p>
+            <w:pPr>
+              <w:pStyle w:val="ListParagraph"/>
+              <w:keepNext/>
+              <w:numPr>
+                <w:ilvl w:val="0"/>
+                <w:numId w:val="2"/>
+              </w:numPr>
+              <w:spacing w:after="40"/>
+            </w:pPr>
+            <w:r>
+              <w:rPr>
+                <w:rFonts w:ascii="Arial" w:cs="Arial" w:eastAsia="Arial" w:hAnsi="Arial"/>
+                <w:sz w:val="19"/>
+                <w:szCs w:val="19"/>
+              </w:rPr>
+              <w:t xml:space="preserve">disaster_recovery_coordinator (LLM Agent, root)</w:t>
+            </w:r>
+          </w:p>
+          <w:p>
+            <w:pPr>
+              <w:pStyle w:val="ListParagraph"/>
+              <w:keepNext/>
+              <w:numPr>
+                <w:ilvl w:val="0"/>
+                <w:numId w:val="2"/>
+              </w:numPr>
+              <w:spacing w:after="40"/>
+            </w:pPr>
+            <w:r>
+              <w:rPr>
+                <w:rFonts w:ascii="Arial" w:cs="Arial" w:eastAsia="Arial" w:hAnsi="Arial"/>
+                <w:sz w:val="19"/>
+                <w:szCs w:val="19"/>
+              </w:rPr>
+              <w:t xml:space="preserve">assistance_pipeline (Sequential Agent), with children intake_loop, issue_classifier_agent, parallel_lookup and response_agent</w:t>
+            </w:r>
+          </w:p>
+          <w:p>
+            <w:pPr>
+              <w:pStyle w:val="ListParagraph"/>
+              <w:keepNext/>
+              <w:numPr>
+                <w:ilvl w:val="0"/>
+                <w:numId w:val="2"/>
+              </w:numPr>
+              <w:spacing w:after="40"/>
+            </w:pPr>
+            <w:r>
+              <w:rPr>
+                <w:rFonts w:ascii="Arial" w:cs="Arial" w:eastAsia="Arial" w:hAnsi="Arial"/>
+                <w:sz w:val="19"/>
+                <w:szCs w:val="19"/>
+              </w:rPr>
+              <w:t xml:space="preserve">intake_loop (Loop Agent), with child intake_agent</w:t>
+            </w:r>
+          </w:p>
+          <w:p>
+            <w:pPr>
+              <w:pStyle w:val="ListParagraph"/>
+              <w:keepNext/>
+              <w:numPr>
+                <w:ilvl w:val="0"/>
+                <w:numId w:val="2"/>
+              </w:numPr>
+              <w:spacing w:after="40"/>
+            </w:pPr>
+            <w:r>
+              <w:rPr>
+                <w:rFonts w:ascii="Arial" w:cs="Arial" w:eastAsia="Arial" w:hAnsi="Arial"/>
+                <w:sz w:val="19"/>
+                <w:szCs w:val="19"/>
+              </w:rPr>
+              <w:t xml:space="preserve">parallel_lookup (Parallel Agent), with children incident_lookup_agent, safety_guidance_agent and relief_lookup_agent</w:t>
+            </w:r>
+          </w:p>
+          <w:p>
+            <w:pPr>
+              <w:pStyle w:val="ListParagraph"/>
+              <w:keepNext/>
+              <w:numPr>
+                <w:ilvl w:val="0"/>
+                <w:numId w:val="2"/>
+              </w:numPr>
+              <w:spacing w:after="40"/>
+            </w:pPr>
+            <w:r>
+              <w:rPr>
+                <w:rFonts w:ascii="Arial" w:cs="Arial" w:eastAsia="Arial" w:hAnsi="Arial"/>
+                <w:sz w:val="19"/>
+                <w:szCs w:val="19"/>
+              </w:rPr>
+              <w:t xml:space="preserve">Six Function tools: record_request_details, classify_issue, lookup_incident_status, get_safety_guidance, find_relief_point and get_source_details.</w:t>
             </w:r>
           </w:p>
         </w:tc>
@@ -8528,18 +8620,81 @@
             <w:r>
               <w:rPr>
                 <w:rFonts w:ascii="Arial" w:cs="Arial" w:eastAsia="Arial" w:hAnsi="Arial"/>
-                <w:i/>
-                <w:iCs/>
-                <w:color w:val="B91C1C"/>
-                <w:sz w:val="19"/>
-                <w:szCs w:val="19"/>
-              </w:rPr>
-              <w:t xml:space="preserve">[To complete: Insert screenshot: Web Builder graph/configuration showing the LLM, Sequential, Parallel, and Loop agents, plus the registered tools]</w:t>
+                <w:sz w:val="19"/>
+                <w:szCs w:val="19"/>
+              </w:rPr>
+              <w:t xml:space="preserve">See the figure(s) directly below this table.</w:t>
             </w:r>
           </w:p>
         </w:tc>
       </w:tr>
     </w:tbl>
+    <w:p>
+      <w:pPr>
+        <w:spacing w:after="60"/>
+      </w:pPr>
+    </w:p>
+    <w:p>
+      <w:pPr>
+        <w:keepNext/>
+        <w:spacing w:after="20"/>
+      </w:pPr>
+      <w:r>
+        <w:drawing>
+          <wp:inline distT="0" distB="0" distL="0" distR="0">
+            <wp:extent cx="5715000" cy="2886075"/>
+            <wp:effectExtent t="0" r="0" b="0" l="0"/>
+            <wp:docPr id="1" name="shot_F1.png" descr="Figure F1. ADK Web Agent Structure: LLM, Sequential, Parallel and Loop agents with the registered Function tools" title="Figure F1. ADK Web Agent Structure: LLM, Sequential, Parallel and Loop agents with the registered Function tools"/>
+            <wp:cNvGraphicFramePr>
+              <a:graphicFrameLocks xmlns:a="http://schemas.openxmlformats.org/drawingml/2006/main" noChangeAspect="1"/>
+            </wp:cNvGraphicFramePr>
+            <a:graphic xmlns:a="http://schemas.openxmlformats.org/drawingml/2006/main">
+              <a:graphicData uri="http://schemas.openxmlformats.org/drawingml/2006/picture">
+                <pic:pic xmlns:pic="http://schemas.openxmlformats.org/drawingml/2006/picture">
+                  <pic:nvPicPr>
+                    <pic:cNvPr id="0" name="" descr=""/>
+                    <pic:cNvPicPr>
+                      <a:picLocks noChangeAspect="1" noChangeArrowheads="1"/>
+                    </pic:cNvPicPr>
+                  </pic:nvPicPr>
+                  <pic:blipFill>
+                    <a:blip r:embed="rId8" cstate="none"/>
+                    <a:srcRect/>
+                    <a:stretch>
+                      <a:fillRect/>
+                    </a:stretch>
+                  </pic:blipFill>
+                  <pic:spPr bwMode="auto">
+                    <a:xfrm>
+                      <a:off x="0" y="0"/>
+                      <a:ext cx="5715000" cy="2886075"/>
+                    </a:xfrm>
+                    <a:prstGeom prst="rect">
+                      <a:avLst/>
+                    </a:prstGeom>
+                  </pic:spPr>
+                </pic:pic>
+              </a:graphicData>
+            </a:graphic>
+          </wp:inline>
+        </w:drawing>
+      </w:r>
+    </w:p>
+    <w:p>
+      <w:pPr>
+        <w:spacing w:after="80"/>
+      </w:pPr>
+      <w:r>
+        <w:rPr>
+          <w:rFonts w:ascii="Arial" w:cs="Arial" w:eastAsia="Arial" w:hAnsi="Arial"/>
+          <w:i/>
+          <w:iCs/>
+          <w:sz w:val="18"/>
+          <w:szCs w:val="18"/>
+        </w:rPr>
+        <w:t xml:space="preserve">Figure F1. ADK Web Agent Structure: LLM, Sequential, Parallel and Loop agents with the registered Function tools</w:t>
+      </w:r>
+    </w:p>
     <w:p>
       <w:pPr>
         <w:spacing w:after="200"/>
@@ -8916,13 +9071,52 @@
             <w:r>
               <w:rPr>
                 <w:rFonts w:ascii="Arial" w:cs="Arial" w:eastAsia="Arial" w:hAnsi="Arial"/>
-                <w:i/>
-                <w:iCs/>
-                <w:color w:val="B91C1C"/>
-                <w:sz w:val="19"/>
-                <w:szCs w:val="19"/>
-              </w:rPr>
-              <w:t xml:space="preserve">[To complete: paste the value observed in ADK Web]</w:t>
+                <w:sz w:val="19"/>
+                <w:szCs w:val="19"/>
+              </w:rPr>
+              <w:t xml:space="preserve">Matches the expected result. The stages ran in order (19 events). response_agent called get_source_details("DR-005,DR-001,DR-002") and replied:</w:t>
+            </w:r>
+          </w:p>
+          <w:p>
+            <w:pPr>
+              <w:keepNext/>
+              <w:spacing w:after="40"/>
+            </w:pPr>
+            <w:r>
+              <w:rPr>
+                <w:rFonts w:ascii="Arial" w:cs="Arial" w:eastAsia="Arial" w:hAnsi="Arial"/>
+                <w:sz w:val="19"/>
+                <w:szCs w:val="19"/>
+              </w:rPr>
+              <w:t xml:space="preserve">Incident Status - Incident ID: INC-005; Area: Kegalle; Incident Type: landslide; Status: restricted_area; Priority: critical; Summary: Slope movement recorded with local access restrictions; Recorded Update: 2026-08-19T16:30.</w:t>
+            </w:r>
+          </w:p>
+          <w:p>
+            <w:pPr>
+              <w:keepNext/>
+              <w:spacing w:after="40"/>
+            </w:pPr>
+            <w:r>
+              <w:rPr>
+                <w:rFonts w:ascii="Arial" w:cs="Arial" w:eastAsia="Arial" w:hAnsi="Arial"/>
+                <w:sz w:val="19"/>
+                <w:szCs w:val="19"/>
+              </w:rPr>
+              <w:t xml:space="preserve">Safety Guidance - Guidance ID: SG-003; Guidance: Move away from steep slopes falling material and visibly unstable ground when it is safe to do so; What to avoid: Do not remain below a moving slope or approach fresh cracks and fallen debris; Escalation note: Contact the relevant local emergency service if movement is active or a person is trapped.</w:t>
+            </w:r>
+          </w:p>
+          <w:p>
+            <w:pPr>
+              <w:keepNext/>
+              <w:spacing w:after="40"/>
+            </w:pPr>
+            <w:r>
+              <w:rPr>
+                <w:rFonts w:ascii="Arial" w:cs="Arial" w:eastAsia="Arial" w:hAnsi="Arial"/>
+                <w:sz w:val="19"/>
+                <w:szCs w:val="19"/>
+              </w:rPr>
+              <w:t xml:space="preserve">Sources - DR-005: Classification rules; DR-001: Incident records; DR-002: Safety guidance (all effective date 2026-08-19, data status SUPPLIED-RECORD). Note: The effective date is a dataset version, not a guarantee of current conditions.</w:t>
             </w:r>
           </w:p>
         </w:tc>
@@ -9059,18 +9253,97 @@
             <w:r>
               <w:rPr>
                 <w:rFonts w:ascii="Arial" w:cs="Arial" w:eastAsia="Arial" w:hAnsi="Arial"/>
-                <w:i/>
-                <w:iCs/>
-                <w:color w:val="B91C1C"/>
-                <w:sz w:val="19"/>
-                <w:szCs w:val="19"/>
-              </w:rPr>
-              <w:t xml:space="preserve">[To complete: Insert screenshot: Workflow graph and Events trace showing ordered execution]</w:t>
+                <w:sz w:val="19"/>
+                <w:szCs w:val="19"/>
+              </w:rPr>
+              <w:t xml:space="preserve">See the figure(s) directly below this table.</w:t>
             </w:r>
           </w:p>
         </w:tc>
       </w:tr>
     </w:tbl>
+    <w:p>
+      <w:pPr>
+        <w:spacing w:after="60"/>
+      </w:pPr>
+    </w:p>
+    <w:p>
+      <w:pPr>
+        <w:keepNext/>
+        <w:spacing w:after="20"/>
+      </w:pPr>
+      <w:r>
+        <w:drawing>
+          <wp:inline distT="0" distB="0" distL="0" distR="0">
+            <wp:extent cx="5715000" cy="2886075"/>
+            <wp:effectExtent t="0" r="0" b="0" l="0"/>
+            <wp:docPr id="1" name="shot_F2.png" descr="Figure F2. Events trace (final events #17 to #19) and workflow graph for the Kegalle landslide request" title="Figure F2. Events trace (final events #17 to #19) and workflow graph for the Kegalle landslide request"/>
+            <wp:cNvGraphicFramePr>
+              <a:graphicFrameLocks xmlns:a="http://schemas.openxmlformats.org/drawingml/2006/main" noChangeAspect="1"/>
+            </wp:cNvGraphicFramePr>
+            <a:graphic xmlns:a="http://schemas.openxmlformats.org/drawingml/2006/main">
+              <a:graphicData uri="http://schemas.openxmlformats.org/drawingml/2006/picture">
+                <pic:pic xmlns:pic="http://schemas.openxmlformats.org/drawingml/2006/picture">
+                  <pic:nvPicPr>
+                    <pic:cNvPr id="0" name="" descr=""/>
+                    <pic:cNvPicPr>
+                      <a:picLocks noChangeAspect="1" noChangeArrowheads="1"/>
+                    </pic:cNvPicPr>
+                  </pic:nvPicPr>
+                  <pic:blipFill>
+                    <a:blip r:embed="rId9" cstate="none"/>
+                    <a:srcRect/>
+                    <a:stretch>
+                      <a:fillRect/>
+                    </a:stretch>
+                  </pic:blipFill>
+                  <pic:spPr bwMode="auto">
+                    <a:xfrm>
+                      <a:off x="0" y="0"/>
+                      <a:ext cx="5715000" cy="2886075"/>
+                    </a:xfrm>
+                    <a:prstGeom prst="rect">
+                      <a:avLst/>
+                    </a:prstGeom>
+                  </pic:spPr>
+                </pic:pic>
+              </a:graphicData>
+            </a:graphic>
+          </wp:inline>
+        </w:drawing>
+      </w:r>
+    </w:p>
+    <w:p>
+      <w:pPr>
+        <w:spacing w:after="80"/>
+      </w:pPr>
+      <w:r>
+        <w:rPr>
+          <w:rFonts w:ascii="Arial" w:cs="Arial" w:eastAsia="Arial" w:hAnsi="Arial"/>
+          <w:i/>
+          <w:iCs/>
+          <w:sz w:val="18"/>
+          <w:szCs w:val="18"/>
+        </w:rPr>
+        <w:t xml:space="preserve">Figure F2. Events trace (final events #17 to #19) and workflow graph for the Kegalle landslide request</w:t>
+      </w:r>
+    </w:p>
+    <w:p>
+      <w:pPr>
+        <w:spacing w:after="60"/>
+      </w:pPr>
+      <w:r>
+        <w:rPr>
+          <w:rFonts w:ascii="Arial" w:cs="Arial" w:eastAsia="Arial" w:hAnsi="Arial"/>
+          <w:i/>
+          <w:iCs/>
+          <w:color w:val="B91C1C"/>
+          <w:sz w:val="19"/>
+          <w:szCs w:val="19"/>
+        </w:rPr>
+        <w:t xml:space="preserve">[Add: top of the F2 Events list showing transfer_to_agent, record_request_details, classify_issue, lookup_incident_status, get_safety_guidance in order]</w:t>
+      </w:r>
+    </w:p>
     <w:p>
       <w:pPr>
         <w:spacing w:after="200"/>
@@ -9447,13 +9720,66 @@
             <w:r>
               <w:rPr>
                 <w:rFonts w:ascii="Arial" w:cs="Arial" w:eastAsia="Arial" w:hAnsi="Arial"/>
-                <w:i/>
-                <w:iCs/>
-                <w:color w:val="B91C1C"/>
-                <w:sz w:val="19"/>
-                <w:szCs w:val="19"/>
-              </w:rPr>
-              <w:t xml:space="preserve">[To complete: paste the value observed in ADK Web]</w:t>
+                <w:sz w:val="19"/>
+                <w:szCs w:val="19"/>
+              </w:rPr>
+              <w:t xml:space="preserve">Matches the expected result. The incident, safety-guidance and relief branches all returned results (21 events):</w:t>
+            </w:r>
+          </w:p>
+          <w:p>
+            <w:pPr>
+              <w:keepNext/>
+              <w:spacing w:after="40"/>
+            </w:pPr>
+            <w:r>
+              <w:rPr>
+                <w:rFonts w:ascii="Arial" w:cs="Arial" w:eastAsia="Arial" w:hAnsi="Arial"/>
+                <w:sz w:val="19"/>
+                <w:szCs w:val="19"/>
+              </w:rPr>
+              <w:t xml:space="preserve">Incident: INC-003, flood, Status: warning_recorded, Priority: critical, Summary: River-level rise and household access disruption recorded, Recorded Update: 2026-08-19T16:00.</w:t>
+            </w:r>
+          </w:p>
+          <w:p>
+            <w:pPr>
+              <w:keepNext/>
+              <w:spacing w:after="40"/>
+            </w:pPr>
+            <w:r>
+              <w:rPr>
+                <w:rFonts w:ascii="Arial" w:cs="Arial" w:eastAsia="Arial" w:hAnsi="Arial"/>
+                <w:sz w:val="19"/>
+                <w:szCs w:val="19"/>
+              </w:rPr>
+              <w:t xml:space="preserve">Safety Guidance: SG-001, Move away from flowing water and low-lying routes and use a listed safer location if it is accessible; What to Avoid: Do not walk drive or cycle through floodwater; Escalation Note: Contact the relevant local emergency service if water is rising rapidly or a person is trapped.</w:t>
+            </w:r>
+          </w:p>
+          <w:p>
+            <w:pPr>
+              <w:keepNext/>
+              <w:spacing w:after="40"/>
+            </w:pPr>
+            <w:r>
+              <w:rPr>
+                <w:rFonts w:ascii="Arial" w:cs="Arial" w:eastAsia="Arial" w:hAnsi="Arial"/>
+                <w:sz w:val="19"/>
+                <w:szCs w:val="19"/>
+              </w:rPr>
+              <w:t xml:space="preserve">Relief Supplies: RP-004, Ratnapura Relief Supplies Point, South district service zone, Services: drinking water|dry food|hygiene supplies, Recorded Status: listed.</w:t>
+            </w:r>
+          </w:p>
+          <w:p>
+            <w:pPr>
+              <w:keepNext/>
+              <w:spacing w:after="40"/>
+            </w:pPr>
+            <w:r>
+              <w:rPr>
+                <w:rFonts w:ascii="Arial" w:cs="Arial" w:eastAsia="Arial" w:hAnsi="Arial"/>
+                <w:sz w:val="19"/>
+                <w:szCs w:val="19"/>
+              </w:rPr>
+              <w:t xml:space="preserve">Sources: DR-001, DR-002, DR-003, DR-005, effective date 2026-08-19, data status SUPPLIED-RECORD.</w:t>
             </w:r>
           </w:p>
         </w:tc>
@@ -9590,18 +9916,97 @@
             <w:r>
               <w:rPr>
                 <w:rFonts w:ascii="Arial" w:cs="Arial" w:eastAsia="Arial" w:hAnsi="Arial"/>
-                <w:i/>
-                <w:iCs/>
-                <w:color w:val="B91C1C"/>
-                <w:sz w:val="19"/>
-                <w:szCs w:val="19"/>
-              </w:rPr>
-              <w:t xml:space="preserve">[To complete: Insert screenshot: Workflow graph and Events trace showing both branches]</w:t>
+                <w:sz w:val="19"/>
+                <w:szCs w:val="19"/>
+              </w:rPr>
+              <w:t xml:space="preserve">See the figure(s) directly below this table.</w:t>
             </w:r>
           </w:p>
         </w:tc>
       </w:tr>
     </w:tbl>
+    <w:p>
+      <w:pPr>
+        <w:spacing w:after="60"/>
+      </w:pPr>
+    </w:p>
+    <w:p>
+      <w:pPr>
+        <w:keepNext/>
+        <w:spacing w:after="20"/>
+      </w:pPr>
+      <w:r>
+        <w:drawing>
+          <wp:inline distT="0" distB="0" distL="0" distR="0">
+            <wp:extent cx="5715000" cy="2886075"/>
+            <wp:effectExtent t="0" r="0" b="0" l="0"/>
+            <wp:docPr id="1" name="shot_F3.png" descr="Figure F3. Combined answer with incident, safety guidance and relief branch results" title="Figure F3. Combined answer with incident, safety guidance and relief branch results"/>
+            <wp:cNvGraphicFramePr>
+              <a:graphicFrameLocks xmlns:a="http://schemas.openxmlformats.org/drawingml/2006/main" noChangeAspect="1"/>
+            </wp:cNvGraphicFramePr>
+            <a:graphic xmlns:a="http://schemas.openxmlformats.org/drawingml/2006/main">
+              <a:graphicData uri="http://schemas.openxmlformats.org/drawingml/2006/picture">
+                <pic:pic xmlns:pic="http://schemas.openxmlformats.org/drawingml/2006/picture">
+                  <pic:nvPicPr>
+                    <pic:cNvPr id="0" name="" descr=""/>
+                    <pic:cNvPicPr>
+                      <a:picLocks noChangeAspect="1" noChangeArrowheads="1"/>
+                    </pic:cNvPicPr>
+                  </pic:nvPicPr>
+                  <pic:blipFill>
+                    <a:blip r:embed="rId10" cstate="none"/>
+                    <a:srcRect/>
+                    <a:stretch>
+                      <a:fillRect/>
+                    </a:stretch>
+                  </pic:blipFill>
+                  <pic:spPr bwMode="auto">
+                    <a:xfrm>
+                      <a:off x="0" y="0"/>
+                      <a:ext cx="5715000" cy="2886075"/>
+                    </a:xfrm>
+                    <a:prstGeom prst="rect">
+                      <a:avLst/>
+                    </a:prstGeom>
+                  </pic:spPr>
+                </pic:pic>
+              </a:graphicData>
+            </a:graphic>
+          </wp:inline>
+        </w:drawing>
+      </w:r>
+    </w:p>
+    <w:p>
+      <w:pPr>
+        <w:spacing w:after="80"/>
+      </w:pPr>
+      <w:r>
+        <w:rPr>
+          <w:rFonts w:ascii="Arial" w:cs="Arial" w:eastAsia="Arial" w:hAnsi="Arial"/>
+          <w:i/>
+          <w:iCs/>
+          <w:sz w:val="18"/>
+          <w:szCs w:val="18"/>
+        </w:rPr>
+        <w:t xml:space="preserve">Figure F3. Combined answer with incident, safety guidance and relief branch results</w:t>
+      </w:r>
+    </w:p>
+    <w:p>
+      <w:pPr>
+        <w:spacing w:after="60"/>
+      </w:pPr>
+      <w:r>
+        <w:rPr>
+          <w:rFonts w:ascii="Arial" w:cs="Arial" w:eastAsia="Arial" w:hAnsi="Arial"/>
+          <w:i/>
+          <w:iCs/>
+          <w:color w:val="B91C1C"/>
+          <w:sz w:val="19"/>
+          <w:szCs w:val="19"/>
+        </w:rPr>
+        <w:t xml:space="preserve">[Add: middle of the F3 Events list showing lookup_incident_status, get_safety_guidance and find_relief_point (the three parallel branches)]</w:t>
+      </w:r>
+    </w:p>
     <w:p>
       <w:pPr>
         <w:spacing w:after="200"/>
@@ -9978,13 +10383,38 @@
             <w:r>
               <w:rPr>
                 <w:rFonts w:ascii="Arial" w:cs="Arial" w:eastAsia="Arial" w:hAnsi="Arial"/>
-                <w:i/>
-                <w:iCs/>
-                <w:color w:val="B91C1C"/>
-                <w:sz w:val="19"/>
-                <w:szCs w:val="19"/>
-              </w:rPr>
-              <w:t xml:space="preserve">[To complete: paste the value observed in ADK Web]</w:t>
+                <w:sz w:val="19"/>
+                <w:szCs w:val="19"/>
+              </w:rPr>
+              <w:t xml:space="preserve">Matches the expected result.</w:t>
+            </w:r>
+          </w:p>
+          <w:p>
+            <w:pPr>
+              <w:keepNext/>
+              <w:spacing w:after="40"/>
+            </w:pPr>
+            <w:r>
+              <w:rPr>
+                <w:rFonts w:ascii="Arial" w:cs="Arial" w:eastAsia="Arial" w:hAnsi="Arial"/>
+                <w:sz w:val="19"/>
+                <w:szCs w:val="19"/>
+              </w:rPr>
+              <w:t xml:space="preserve">Turn 1: intake_loop returned NEEDS_INPUT and the assistant asked one question: "Which incident type are you asking about in Colombo: blocked_route or flood?" The later stages were skipped.</w:t>
+            </w:r>
+          </w:p>
+          <w:p>
+            <w:pPr>
+              <w:keepNext/>
+              <w:spacing w:after="40"/>
+            </w:pPr>
+            <w:r>
+              <w:rPr>
+                <w:rFonts w:ascii="Arial" w:cs="Arial" w:eastAsia="Arial" w:hAnsi="Arial"/>
+                <w:sz w:val="19"/>
+                <w:szCs w:val="19"/>
+              </w:rPr>
+              <w:t xml:space="preserve">Turn 2 ("Flood", invocation #2, events up to #30): the loop completed and the workflow continued. incident_lookup_agent returned INC-001, Colombo, flood, status monitoring, priority high, "Localized surface flooding recorded near low-lying access roads", recorded 2026-08-19T17:00. The answer included SG-001 (guidance, what to avoid, escalation note) and sources DR-001, DR-002, DR-005 via get_source_details("DR-005,DR-002,DR-001").</w:t>
             </w:r>
           </w:p>
         </w:tc>
@@ -10121,18 +10551,97 @@
             <w:r>
               <w:rPr>
                 <w:rFonts w:ascii="Arial" w:cs="Arial" w:eastAsia="Arial" w:hAnsi="Arial"/>
-                <w:i/>
-                <w:iCs/>
-                <w:color w:val="B91C1C"/>
-                <w:sz w:val="19"/>
-                <w:szCs w:val="19"/>
-              </w:rPr>
-              <w:t xml:space="preserve">[To complete: Insert screenshot: Workflow graph and Events trace showing the bounded follow-up]</w:t>
+                <w:sz w:val="19"/>
+                <w:szCs w:val="19"/>
+              </w:rPr>
+              <w:t xml:space="preserve">See the figure(s) directly below this table.</w:t>
             </w:r>
           </w:p>
         </w:tc>
       </w:tr>
     </w:tbl>
+    <w:p>
+      <w:pPr>
+        <w:spacing w:after="60"/>
+      </w:pPr>
+    </w:p>
+    <w:p>
+      <w:pPr>
+        <w:spacing w:after="60"/>
+      </w:pPr>
+      <w:r>
+        <w:rPr>
+          <w:rFonts w:ascii="Arial" w:cs="Arial" w:eastAsia="Arial" w:hAnsi="Arial"/>
+          <w:i/>
+          <w:iCs/>
+          <w:color w:val="B91C1C"/>
+          <w:sz w:val="19"/>
+          <w:szCs w:val="19"/>
+        </w:rPr>
+        <w:t xml:space="preserve">[Add: F4 invocation #1 showing the question "Which incident type are you asking about in Colombo: blocked_route or flood?"]</w:t>
+      </w:r>
+    </w:p>
+    <w:p>
+      <w:pPr>
+        <w:keepNext/>
+        <w:spacing w:after="20"/>
+      </w:pPr>
+      <w:r>
+        <w:drawing>
+          <wp:inline distT="0" distB="0" distL="0" distR="0">
+            <wp:extent cx="5715000" cy="2886075"/>
+            <wp:effectExtent t="0" r="0" b="0" l="0"/>
+            <wp:docPr id="1" name="shot_F4b.png" descr="Figure F4. Invocation #2 (&quot;Flood&quot;): the workflow continued after the missing value was supplied" title="Figure F4. Invocation #2 (&quot;Flood&quot;): the workflow continued after the missing value was supplied"/>
+            <wp:cNvGraphicFramePr>
+              <a:graphicFrameLocks xmlns:a="http://schemas.openxmlformats.org/drawingml/2006/main" noChangeAspect="1"/>
+            </wp:cNvGraphicFramePr>
+            <a:graphic xmlns:a="http://schemas.openxmlformats.org/drawingml/2006/main">
+              <a:graphicData uri="http://schemas.openxmlformats.org/drawingml/2006/picture">
+                <pic:pic xmlns:pic="http://schemas.openxmlformats.org/drawingml/2006/picture">
+                  <pic:nvPicPr>
+                    <pic:cNvPr id="0" name="" descr=""/>
+                    <pic:cNvPicPr>
+                      <a:picLocks noChangeAspect="1" noChangeArrowheads="1"/>
+                    </pic:cNvPicPr>
+                  </pic:nvPicPr>
+                  <pic:blipFill>
+                    <a:blip r:embed="rId11" cstate="none"/>
+                    <a:srcRect/>
+                    <a:stretch>
+                      <a:fillRect/>
+                    </a:stretch>
+                  </pic:blipFill>
+                  <pic:spPr bwMode="auto">
+                    <a:xfrm>
+                      <a:off x="0" y="0"/>
+                      <a:ext cx="5715000" cy="2886075"/>
+                    </a:xfrm>
+                    <a:prstGeom prst="rect">
+                      <a:avLst/>
+                    </a:prstGeom>
+                  </pic:spPr>
+                </pic:pic>
+              </a:graphicData>
+            </a:graphic>
+          </wp:inline>
+        </w:drawing>
+      </w:r>
+    </w:p>
+    <w:p>
+      <w:pPr>
+        <w:spacing w:after="80"/>
+      </w:pPr>
+      <w:r>
+        <w:rPr>
+          <w:rFonts w:ascii="Arial" w:cs="Arial" w:eastAsia="Arial" w:hAnsi="Arial"/>
+          <w:i/>
+          <w:iCs/>
+          <w:sz w:val="18"/>
+          <w:szCs w:val="18"/>
+        </w:rPr>
+        <w:t xml:space="preserve">Figure F4. Invocation #2 ("Flood"): the workflow continued after the missing value was supplied</w:t>
+      </w:r>
+    </w:p>
     <w:p>
       <w:pPr>
         <w:spacing w:after="200"/>
@@ -10509,13 +11018,38 @@
             <w:r>
               <w:rPr>
                 <w:rFonts w:ascii="Arial" w:cs="Arial" w:eastAsia="Arial" w:hAnsi="Arial"/>
-                <w:i/>
-                <w:iCs/>
-                <w:color w:val="B91C1C"/>
-                <w:sz w:val="19"/>
-                <w:szCs w:val="19"/>
-              </w:rPr>
-              <w:t xml:space="preserve">[To complete: paste the value observed in ADK Web]</w:t>
+                <w:sz w:val="19"/>
+                <w:szCs w:val="19"/>
+              </w:rPr>
+              <w:t xml:space="preserve">Matches the expected result.</w:t>
+            </w:r>
+          </w:p>
+          <w:p>
+            <w:pPr>
+              <w:keepNext/>
+              <w:spacing w:after="40"/>
+            </w:pPr>
+            <w:r>
+              <w:rPr>
+                <w:rFonts w:ascii="Arial" w:cs="Arial" w:eastAsia="Arial" w:hAnsi="Arial"/>
+                <w:sz w:val="19"/>
+                <w:szCs w:val="19"/>
+              </w:rPr>
+              <w:t xml:space="preserve">Prompt A (2 events, no transfer): "I cannot perform actions such as dispatching rescue boats or reserving shelter places. I can show recorded incident status, recorded safety guidance, and listed relief points. If you or your family are in immediate danger, please move away from immediate danger when possible and contact the relevant local emergency service or authority."</w:t>
+            </w:r>
+          </w:p>
+          <w:p>
+            <w:pPr>
+              <w:keepNext/>
+              <w:spacing w:after="40"/>
+            </w:pPr>
+            <w:r>
+              <w:rPr>
+                <w:rFonts w:ascii="Arial" w:cs="Arial" w:eastAsia="Arial" w:hAnsi="Arial"/>
+                <w:sz w:val="19"/>
+                <w:szCs w:val="19"/>
+              </w:rPr>
+              <w:t xml:space="preserve">Prompt B (11 events): transfer_to_agent, then record_request_details, then "No supplied records exist for area 'Galle'. Please note that our records only cover Colombo, Ratnapura and Kegalle and the incident types flood, landslide and blocked_route." Events #7 to #11 show the later stages skipped (incident_result, guidance_result and relief_result set to SKIPPED). No shelter, location or contact number was invented.</w:t>
             </w:r>
           </w:p>
         </w:tc>
@@ -10652,18 +11186,142 @@
             <w:r>
               <w:rPr>
                 <w:rFonts w:ascii="Arial" w:cs="Arial" w:eastAsia="Arial" w:hAnsi="Arial"/>
-                <w:i/>
-                <w:iCs/>
-                <w:color w:val="B91C1C"/>
-                <w:sz w:val="19"/>
-                <w:szCs w:val="19"/>
-              </w:rPr>
-              <w:t xml:space="preserve">[To complete: Insert screenshot: Events trace showing the safe result]</w:t>
+                <w:sz w:val="19"/>
+                <w:szCs w:val="19"/>
+              </w:rPr>
+              <w:t xml:space="preserve">See the figure(s) directly below this table.</w:t>
             </w:r>
           </w:p>
         </w:tc>
       </w:tr>
     </w:tbl>
+    <w:p>
+      <w:pPr>
+        <w:spacing w:after="60"/>
+      </w:pPr>
+    </w:p>
+    <w:p>
+      <w:pPr>
+        <w:keepNext/>
+        <w:spacing w:after="20"/>
+      </w:pPr>
+      <w:r>
+        <w:drawing>
+          <wp:inline distT="0" distB="0" distL="0" distR="0">
+            <wp:extent cx="5715000" cy="2886075"/>
+            <wp:effectExtent t="0" r="0" b="0" l="0"/>
+            <wp:docPr id="1" name="shot_F5a.png" descr="Figure F5a. Unsupported action refused by disaster_recovery_coordinator without transfer" title="Figure F5a. Unsupported action refused by disaster_recovery_coordinator without transfer"/>
+            <wp:cNvGraphicFramePr>
+              <a:graphicFrameLocks xmlns:a="http://schemas.openxmlformats.org/drawingml/2006/main" noChangeAspect="1"/>
+            </wp:cNvGraphicFramePr>
+            <a:graphic xmlns:a="http://schemas.openxmlformats.org/drawingml/2006/main">
+              <a:graphicData uri="http://schemas.openxmlformats.org/drawingml/2006/picture">
+                <pic:pic xmlns:pic="http://schemas.openxmlformats.org/drawingml/2006/picture">
+                  <pic:nvPicPr>
+                    <pic:cNvPr id="0" name="" descr=""/>
+                    <pic:cNvPicPr>
+                      <a:picLocks noChangeAspect="1" noChangeArrowheads="1"/>
+                    </pic:cNvPicPr>
+                  </pic:nvPicPr>
+                  <pic:blipFill>
+                    <a:blip r:embed="rId12" cstate="none"/>
+                    <a:srcRect/>
+                    <a:stretch>
+                      <a:fillRect/>
+                    </a:stretch>
+                  </pic:blipFill>
+                  <pic:spPr bwMode="auto">
+                    <a:xfrm>
+                      <a:off x="0" y="0"/>
+                      <a:ext cx="5715000" cy="2886075"/>
+                    </a:xfrm>
+                    <a:prstGeom prst="rect">
+                      <a:avLst/>
+                    </a:prstGeom>
+                  </pic:spPr>
+                </pic:pic>
+              </a:graphicData>
+            </a:graphic>
+          </wp:inline>
+        </w:drawing>
+      </w:r>
+    </w:p>
+    <w:p>
+      <w:pPr>
+        <w:spacing w:after="80"/>
+      </w:pPr>
+      <w:r>
+        <w:rPr>
+          <w:rFonts w:ascii="Arial" w:cs="Arial" w:eastAsia="Arial" w:hAnsi="Arial"/>
+          <w:i/>
+          <w:iCs/>
+          <w:sz w:val="18"/>
+          <w:szCs w:val="18"/>
+        </w:rPr>
+        <w:t xml:space="preserve">Figure F5a. Unsupported action refused by disaster_recovery_coordinator without transfer</w:t>
+      </w:r>
+    </w:p>
+    <w:p>
+      <w:pPr>
+        <w:keepNext/>
+        <w:spacing w:after="20"/>
+      </w:pPr>
+      <w:r>
+        <w:drawing>
+          <wp:inline distT="0" distB="0" distL="0" distR="0">
+            <wp:extent cx="5715000" cy="2886075"/>
+            <wp:effectExtent t="0" r="0" b="0" l="0"/>
+            <wp:docPr id="1" name="shot_F5b.png" descr="Figure F5b. Not-found result for Galle; later stages skipped" title="Figure F5b. Not-found result for Galle; later stages skipped"/>
+            <wp:cNvGraphicFramePr>
+              <a:graphicFrameLocks xmlns:a="http://schemas.openxmlformats.org/drawingml/2006/main" noChangeAspect="1"/>
+            </wp:cNvGraphicFramePr>
+            <a:graphic xmlns:a="http://schemas.openxmlformats.org/drawingml/2006/main">
+              <a:graphicData uri="http://schemas.openxmlformats.org/drawingml/2006/picture">
+                <pic:pic xmlns:pic="http://schemas.openxmlformats.org/drawingml/2006/picture">
+                  <pic:nvPicPr>
+                    <pic:cNvPr id="0" name="" descr=""/>
+                    <pic:cNvPicPr>
+                      <a:picLocks noChangeAspect="1" noChangeArrowheads="1"/>
+                    </pic:cNvPicPr>
+                  </pic:nvPicPr>
+                  <pic:blipFill>
+                    <a:blip r:embed="rId13" cstate="none"/>
+                    <a:srcRect/>
+                    <a:stretch>
+                      <a:fillRect/>
+                    </a:stretch>
+                  </pic:blipFill>
+                  <pic:spPr bwMode="auto">
+                    <a:xfrm>
+                      <a:off x="0" y="0"/>
+                      <a:ext cx="5715000" cy="2886075"/>
+                    </a:xfrm>
+                    <a:prstGeom prst="rect">
+                      <a:avLst/>
+                    </a:prstGeom>
+                  </pic:spPr>
+                </pic:pic>
+              </a:graphicData>
+            </a:graphic>
+          </wp:inline>
+        </w:drawing>
+      </w:r>
+    </w:p>
+    <w:p>
+      <w:pPr>
+        <w:spacing w:after="80"/>
+      </w:pPr>
+      <w:r>
+        <w:rPr>
+          <w:rFonts w:ascii="Arial" w:cs="Arial" w:eastAsia="Arial" w:hAnsi="Arial"/>
+          <w:i/>
+          <w:iCs/>
+          <w:sz w:val="18"/>
+          <w:szCs w:val="18"/>
+        </w:rPr>
+        <w:t xml:space="preserve">Figure F5b. Not-found result for Galle; later stages skipped</w:t>
+      </w:r>
+    </w:p>
     <w:p>
       <w:pPr>
         <w:spacing w:after="200"/>
@@ -10679,7 +11337,7 @@
         <w:rPr>
           <w:rFonts w:ascii="Arial" w:cs="Arial" w:eastAsia="Arial" w:hAnsi="Arial"/>
         </w:rPr>
-        <w:t xml:space="preserve">Additional check: immediate danger</w:t>
+        <w:t xml:space="preserve">Additional design check: immediate danger (not part of the required evidence)</w:t>
       </w:r>
     </w:p>
     <w:p>

</xml_diff>